<commit_message>
Herb book: bring back Bärlauch with buy-it-if-unsure advice
Co-Authored-By: Claude Opus 5.5 <noreply@anthropic.com>
Claude-Session: https://claude.ai/code/session_01Rqm6WzG9kWnhYjBnATSipi
</commit_message>
<xml_diff>
--- a/buecher/band-1-kraeuter-wildpflanzen/Editor-Datei-Band-1.docx
+++ b/buecher/band-1-kraeuter-wildpflanzen/Editor-Datei-Band-1.docx
@@ -587,6 +587,52 @@
         <w:keepNext/>
       </w:pPr>
       <w:r>
+        <w:t xml:space="preserve">4. Bärlauch</w:t>
+      </w:r>
+    </w:p>
+    <w:tbl>
+      <w:tblPr>
+        <w:tblW w:type="dxa" w:w="9070"/>
+        <w:tblBorders>
+          <w:top w:val="single" w:color="auto" w:sz="4"/>
+          <w:left w:val="single" w:color="auto" w:sz="4"/>
+          <w:bottom w:val="single" w:color="auto" w:sz="4"/>
+          <w:right w:val="single" w:color="auto" w:sz="4"/>
+          <w:insideH w:val="single" w:color="auto" w:sz="4"/>
+          <w:insideV w:val="single" w:color="auto" w:sz="4"/>
+        </w:tblBorders>
+      </w:tblPr>
+      <w:tblGrid>
+        <w:gridCol w:w="9070"/>
+      </w:tblGrid>
+      <w:tr>
+        <w:trPr>
+          <w:trHeight w:val="2000" w:hRule="atLeast"/>
+        </w:trPr>
+        <w:tc>
+          <w:tcPr>
+            <w:tcW w:type="dxa" w:w="9070"/>
+            <w:tcBorders>
+              <w:top w:val="single" w:color="C9C2AE" w:sz="4"/>
+              <w:left w:val="single" w:color="C9C2AE" w:sz="4"/>
+              <w:bottom w:val="single" w:color="C9C2AE" w:sz="4"/>
+              <w:right w:val="single" w:color="C9C2AE" w:sz="4"/>
+            </w:tcBorders>
+          </w:tcPr>
+          <w:p>
+            <w:r>
+              <w:t xml:space="preserve"/>
+            </w:r>
+          </w:p>
+        </w:tc>
+      </w:tr>
+    </w:tbl>
+    <w:p>
+      <w:pPr>
+        <w:pStyle w:val="Heading3"/>
+        <w:keepNext/>
+      </w:pPr>
+      <w:r>
         <w:t xml:space="preserve">5. Gänseblümchen</w:t>
       </w:r>
     </w:p>
@@ -3348,7 +3394,7 @@
         <w:pStyle w:val="Heading2"/>
       </w:pPr>
       <w:r>
-        <w:t xml:space="preserve">Alle Pflanzen (58) – 6 davon mit Priorität „hoch“</w:t>
+        <w:t xml:space="preserve">Alle Pflanzen (59) – 7 davon mit Priorität „hoch“</w:t>
       </w:r>
     </w:p>
     <w:tbl>
@@ -3951,6 +3997,255 @@
                 <w:szCs w:val="18"/>
               </w:rPr>
               <w:t xml:space="preserve">normal</w:t>
+            </w:r>
+          </w:p>
+        </w:tc>
+        <w:tc>
+          <w:tcPr>
+            <w:tcW w:type="dxa" w:w="1100"/>
+            <w:tcBorders>
+              <w:top w:val="single" w:color="C9C2AE" w:sz="4"/>
+              <w:left w:val="single" w:color="C9C2AE" w:sz="4"/>
+              <w:bottom w:val="single" w:color="C9C2AE" w:sz="4"/>
+              <w:right w:val="single" w:color="C9C2AE" w:sz="4"/>
+            </w:tcBorders>
+            <w:tcMar>
+              <w:top w:type="dxa" w:w="50"/>
+              <w:left w:type="dxa" w:w="80"/>
+              <w:bottom w:type="dxa" w:w="50"/>
+              <w:right w:type="dxa" w:w="80"/>
+            </w:tcMar>
+          </w:tcPr>
+          <w:p>
+            <w:pPr>
+              <w:jc w:val="center"/>
+            </w:pPr>
+            <w:r>
+              <w:rPr>
+                <w:sz w:val="28"/>
+                <w:szCs w:val="28"/>
+              </w:rPr>
+              <w:t xml:space="preserve">☐</w:t>
+            </w:r>
+          </w:p>
+        </w:tc>
+      </w:tr>
+      <w:tr>
+        <w:trPr>
+          <w:cantSplit/>
+        </w:trPr>
+        <w:tc>
+          <w:tcPr>
+            <w:tcW w:type="dxa" w:w="600"/>
+            <w:tcBorders>
+              <w:top w:val="single" w:color="C9C2AE" w:sz="4"/>
+              <w:left w:val="single" w:color="C9C2AE" w:sz="4"/>
+              <w:bottom w:val="single" w:color="C9C2AE" w:sz="4"/>
+              <w:right w:val="single" w:color="C9C2AE" w:sz="4"/>
+            </w:tcBorders>
+            <w:tcMar>
+              <w:top w:type="dxa" w:w="50"/>
+              <w:left w:type="dxa" w:w="80"/>
+              <w:bottom w:type="dxa" w:w="50"/>
+              <w:right w:type="dxa" w:w="80"/>
+            </w:tcMar>
+          </w:tcPr>
+          <w:p>
+            <w:pPr>
+              <w:jc w:val="left"/>
+            </w:pPr>
+            <w:r>
+              <w:rPr>
+                <w:sz w:val="18"/>
+                <w:szCs w:val="18"/>
+              </w:rPr>
+              <w:t xml:space="preserve">4</w:t>
+            </w:r>
+          </w:p>
+        </w:tc>
+        <w:tc>
+          <w:tcPr>
+            <w:tcW w:type="dxa" w:w="2700"/>
+            <w:tcBorders>
+              <w:top w:val="single" w:color="C9C2AE" w:sz="4"/>
+              <w:left w:val="single" w:color="C9C2AE" w:sz="4"/>
+              <w:bottom w:val="single" w:color="C9C2AE" w:sz="4"/>
+              <w:right w:val="single" w:color="C9C2AE" w:sz="4"/>
+            </w:tcBorders>
+            <w:tcMar>
+              <w:top w:type="dxa" w:w="50"/>
+              <w:left w:type="dxa" w:w="80"/>
+              <w:bottom w:type="dxa" w:w="50"/>
+              <w:right w:type="dxa" w:w="80"/>
+            </w:tcMar>
+          </w:tcPr>
+          <w:p>
+            <w:pPr>
+              <w:jc w:val="left"/>
+            </w:pPr>
+            <w:r>
+              <w:rPr>
+                <w:b/>
+                <w:bCs/>
+                <w:sz w:val="18"/>
+                <w:szCs w:val="18"/>
+              </w:rPr>
+              <w:t xml:space="preserve">Bärlauch</w:t>
+            </w:r>
+          </w:p>
+          <w:p>
+            <w:pPr>
+              <w:jc w:val="left"/>
+            </w:pPr>
+            <w:r>
+              <w:rPr>
+                <w:sz w:val="18"/>
+                <w:szCs w:val="18"/>
+              </w:rPr>
+              <w:t xml:space="preserve">Allium ursinum</w:t>
+            </w:r>
+          </w:p>
+        </w:tc>
+        <w:tc>
+          <w:tcPr>
+            <w:tcW w:type="dxa" w:w="2600"/>
+            <w:tcBorders>
+              <w:top w:val="single" w:color="C9C2AE" w:sz="4"/>
+              <w:left w:val="single" w:color="C9C2AE" w:sz="4"/>
+              <w:bottom w:val="single" w:color="C9C2AE" w:sz="4"/>
+              <w:right w:val="single" w:color="C9C2AE" w:sz="4"/>
+            </w:tcBorders>
+            <w:tcMar>
+              <w:top w:type="dxa" w:w="50"/>
+              <w:left w:type="dxa" w:w="80"/>
+              <w:bottom w:type="dxa" w:w="50"/>
+              <w:right w:type="dxa" w:w="80"/>
+            </w:tcMar>
+          </w:tcPr>
+          <w:p>
+            <w:pPr>
+              <w:jc w:val="left"/>
+            </w:pPr>
+            <w:r>
+              <w:rPr>
+                <w:sz w:val="18"/>
+                <w:szCs w:val="18"/>
+              </w:rPr>
+              <w:t xml:space="preserve">Blüte: April bis Mai</w:t>
+            </w:r>
+          </w:p>
+          <w:p>
+            <w:pPr>
+              <w:jc w:val="left"/>
+            </w:pPr>
+            <w:r>
+              <w:rPr>
+                <w:sz w:val="18"/>
+                <w:szCs w:val="18"/>
+              </w:rPr>
+              <w:t xml:space="preserve">Ernte: Mär–Jun</w:t>
+            </w:r>
+          </w:p>
+        </w:tc>
+        <w:tc>
+          <w:tcPr>
+            <w:tcW w:type="dxa" w:w="6300"/>
+            <w:tcBorders>
+              <w:top w:val="single" w:color="C9C2AE" w:sz="4"/>
+              <w:left w:val="single" w:color="C9C2AE" w:sz="4"/>
+              <w:bottom w:val="single" w:color="C9C2AE" w:sz="4"/>
+              <w:right w:val="single" w:color="C9C2AE" w:sz="4"/>
+            </w:tcBorders>
+            <w:tcMar>
+              <w:top w:type="dxa" w:w="50"/>
+              <w:left w:type="dxa" w:w="80"/>
+              <w:bottom w:type="dxa" w:w="50"/>
+              <w:right w:type="dxa" w:w="80"/>
+            </w:tcMar>
+          </w:tcPr>
+          <w:p>
+            <w:pPr>
+              <w:jc w:val="left"/>
+            </w:pPr>
+            <w:r>
+              <w:rPr>
+                <w:sz w:val="18"/>
+                <w:szCs w:val="18"/>
+              </w:rPr>
+              <w:t xml:space="preserve">ganze Pflanze am Standort, Blatt, Blüte, Wurzel</w:t>
+            </w:r>
+          </w:p>
+          <w:p>
+            <w:pPr>
+              <w:jc w:val="left"/>
+            </w:pPr>
+            <w:r>
+              <w:rPr>
+                <w:b/>
+                <w:bCs/>
+                <w:sz w:val="18"/>
+                <w:szCs w:val="18"/>
+              </w:rPr>
+              <w:t xml:space="preserve">Merkmale:</w:t>
+            </w:r>
+            <w:r>
+              <w:rPr>
+                <w:sz w:val="18"/>
+                <w:szCs w:val="18"/>
+              </w:rPr>
+              <w:t xml:space="preserve"> einzeln gestielte Blätter, matte Blattunterseite, Zwiebel</w:t>
+            </w:r>
+          </w:p>
+          <w:p>
+            <w:pPr>
+              <w:jc w:val="left"/>
+            </w:pPr>
+            <w:r>
+              <w:rPr>
+                <w:b/>
+                <w:bCs/>
+                <w:sz w:val="18"/>
+                <w:szCs w:val="18"/>
+              </w:rPr>
+              <w:t xml:space="preserve">Zum Vergleich:</w:t>
+            </w:r>
+            <w:r>
+              <w:rPr>
+                <w:sz w:val="18"/>
+                <w:szCs w:val="18"/>
+              </w:rPr>
+              <w:t xml:space="preserve"> Maiglöckchen, Herbstzeitlose, Gefleckter Aronstab, Weiße Germer, Vielblütige Weißwurz</w:t>
+            </w:r>
+          </w:p>
+        </w:tc>
+        <w:tc>
+          <w:tcPr>
+            <w:tcW w:type="dxa" w:w="1100"/>
+            <w:tcBorders>
+              <w:top w:val="single" w:color="C9C2AE" w:sz="4"/>
+              <w:left w:val="single" w:color="C9C2AE" w:sz="4"/>
+              <w:bottom w:val="single" w:color="C9C2AE" w:sz="4"/>
+              <w:right w:val="single" w:color="C9C2AE" w:sz="4"/>
+            </w:tcBorders>
+            <w:tcMar>
+              <w:top w:type="dxa" w:w="50"/>
+              <w:left w:type="dxa" w:w="80"/>
+              <w:bottom w:type="dxa" w:w="50"/>
+              <w:right w:type="dxa" w:w="80"/>
+            </w:tcMar>
+          </w:tcPr>
+          <w:p>
+            <w:pPr>
+              <w:jc w:val="left"/>
+            </w:pPr>
+            <w:r>
+              <w:rPr>
+                <w:b/>
+                <w:bCs/>
+                <w:sz w:val="18"/>
+                <w:szCs w:val="18"/>
+              </w:rPr>
+              <w:t xml:space="preserve">hoch</w:t>
             </w:r>
           </w:p>
         </w:tc>

</xml_diff>